<commit_message>
Deploy simternship build 2026-08-24
</commit_message>
<xml_diff>
--- a/hub/files/Case1.docx
+++ b/hub/files/Case1.docx
@@ -57,7 +57,7 @@
                 <w:b/>
                 <w:sz w:val="19"/>
               </w:rPr>
-              <w:t>Participation component — presenting team (Team 1) scored on the rubric below; every team submits the filled worksheet</w:t>
+              <w:t>Participation component — worksheet only (I present this case as the format demonstration); every team submits the filled worksheet</w:t>
             </w:r>
           </w:p>
         </w:tc>
@@ -95,7 +95,7 @@
               <w:rPr>
                 <w:sz w:val="19"/>
               </w:rPr>
-              <w:t>Mon Sep 14, start of class (worksheet, all teams); Team 1 presents in class that day</w:t>
+              <w:t>Mon Sep 14, start of class (worksheet, all teams); I present the case in person that day as the demo for Cases 2–6</w:t>
             </w:r>
           </w:p>
         </w:tc>
@@ -171,7 +171,7 @@
               <w:rPr>
                 <w:sz w:val="19"/>
               </w:rPr>
-              <w:t>Canvas — this doc's worksheet filled (one PDF per team); Team 1 also uploads slides before class</w:t>
+              <w:t>Canvas — this doc's worksheet filled (one PDF per team)</w:t>
             </w:r>
           </w:p>
         </w:tc>
@@ -213,7 +213,7 @@
         <w:t>Define the Research Problem</w:t>
       </w:r>
       <w:r>
-        <w:t xml:space="preserve"> (Dana's team did this for a fictional client) → Now the case: a real small-business owner with a fuzzy problem and no research plan. Cases 1 &amp; 3 present together — this is the problem-definition half.</w:t>
+        <w:t xml:space="preserve"> (Dana's team did this for a fictional client) → Now the case: a real small-business owner with a fuzzy problem and no research plan. Case 2 (Research Questions, Wednesday) is this case's RQ-typing sibling.</w:t>
       </w:r>
     </w:p>
     <w:p>
@@ -318,16 +318,7 @@
         <w:pStyle w:val="ListNumber"/>
       </w:pPr>
       <w:r>
-        <w:t xml:space="preserve">Fill the worksheet (Appendix B). </w:t>
-      </w:r>
-      <w:r>
-        <w:rPr>
-          <w:b/>
-        </w:rPr>
-        <w:t>Team 1:</w:t>
-      </w:r>
-      <w:r>
-        <w:t xml:space="preserve"> build slides that teach the class your thinking process, the confusing spots, and your recommendation — 10–15 minutes, professor-role.</w:t>
+        <w:t>Fill the worksheet (Appendix B). Then watch my demo closely — it models exactly what your team's own case presentation (Cases 2–6) must do: re-teach a key concept, critique a prior attempt, and run an interactive exercise.</w:t>
       </w:r>
     </w:p>
     <w:p>
@@ -363,20 +354,6 @@
         <w:t xml:space="preserve">☐  </w:t>
       </w:r>
       <w:r>
-        <w:t>Slides — Team 1 only, uploaded before class</w:t>
-      </w:r>
-    </w:p>
-    <w:p>
-      <w:pPr>
-        <w:ind w:left="360"/>
-      </w:pPr>
-      <w:r>
-        <w:rPr>
-          <w:b/>
-        </w:rPr>
-        <w:t xml:space="preserve">☐  </w:t>
-      </w:r>
-      <w:r>
         <w:t>AI reflection (below) answered at the end of the worksheet</w:t>
       </w:r>
     </w:p>
@@ -390,7 +367,7 @@
     </w:p>
     <w:p>
       <w:r>
-        <w:t>Rubric applies to the presenting team; non-presenting teams earn participation credit for a complete, good-faith worksheet.</w:t>
+        <w:t>No student team presents this case — every team earns participation credit for a complete, good-faith worksheet. The rubric below is the one your team's Cases 2–6 presentation will be scored on; my demo models it.</w:t>
       </w:r>
     </w:p>
     <w:tbl>
@@ -593,7 +570,7 @@
               <w:rPr>
                 <w:sz w:val="19"/>
               </w:rPr>
-              <w:t>Teaching the class</w:t>
+              <w:t>Beat the benchmark: re-teach &amp; critique</w:t>
             </w:r>
           </w:p>
         </w:tc>
@@ -629,20 +606,7 @@
               <w:rPr>
                 <w:sz w:val="19"/>
               </w:rPr>
-              <w:t xml:space="preserve">Presentation walks through the </w:t>
-            </w:r>
-            <w:r>
-              <w:rPr>
-                <w:i/>
-                <w:sz w:val="19"/>
-              </w:rPr>
-              <w:t>thinking process</w:t>
-            </w:r>
-            <w:r>
-              <w:rPr>
-                <w:sz w:val="19"/>
-              </w:rPr>
-              <w:t xml:space="preserve"> and names the confusing spots (e.g., symptom vs. problem), with a discussion question for the class</w:t>
+              <w:t>A key concept re-taught measurably better than the prior recording; the critique names specifics, not vibes</w:t>
             </w:r>
           </w:p>
         </w:tc>
@@ -662,7 +626,7 @@
               <w:rPr>
                 <w:sz w:val="19"/>
               </w:rPr>
-              <w:t>Slides &amp; delivery</w:t>
+              <w:t>Interactive exercise &amp; delivery</w:t>
             </w:r>
           </w:p>
         </w:tc>
@@ -698,7 +662,7 @@
               <w:rPr>
                 <w:sz w:val="19"/>
               </w:rPr>
-              <w:t>10–15 minutes, clear slides, professor-role — teaching the case, not reading it</w:t>
+              <w:t>Original exercise that makes the class apply the skill; 15 min + 5 Q&amp;A, clear slides, run to time</w:t>
             </w:r>
           </w:p>
         </w:tc>

</xml_diff>

<commit_message>
Deploy simternship build 2026-08-27
</commit_message>
<xml_diff>
--- a/hub/files/Case1.docx
+++ b/hub/files/Case1.docx
@@ -209,13 +209,13 @@
         <w:t>Problem definition → research questions</w:t>
       </w:r>
       <w:r>
-        <w:t xml:space="preserve"> (watch the assigned pre-watch recording first) → Practice — Summit Point round </w:t>
+        <w:t xml:space="preserve"> (watch the assigned pre-watch recording first) → Practice — Summit Point </w:t>
       </w:r>
       <w:r>
         <w:rPr>
           <w:b/>
         </w:rPr>
-        <w:t>r15</w:t>
+        <w:t>Round 5</w:t>
       </w:r>
       <w:r>
         <w:t xml:space="preserve"> </w:t>
@@ -262,16 +262,16 @@
         <w:t>AI voice tutor</w:t>
       </w:r>
       <w:r>
-        <w:t xml:space="preserve"> (ChatGPT voice mode; starter prompt posted with the case), with this week's assigned </w:t>
+        <w:t xml:space="preserve"> (ChatGPT voice mode; starter prompt below) with the assigned textbook chapter — </w:t>
       </w:r>
       <w:r>
         <w:rPr>
           <w:b/>
         </w:rPr>
-        <w:t>textbook chapter</w:t>
+        <w:t>Ch. 2, The Marketing Research Process</w:t>
       </w:r>
       <w:r>
-        <w:t xml:space="preserve"> in hand as context — it quizzes and challenges rather than answering. Disclose the session in the AI reflection.*</w:t>
+        <w:t xml:space="preserve"> — in hand as context. The tutor quizzes and challenges rather than answering. Disclose the session in the AI reflection.*</w:t>
       </w:r>
     </w:p>
     <w:p>
@@ -355,7 +355,41 @@
         <w:pStyle w:val="ListNumber"/>
       </w:pPr>
       <w:r>
-        <w:t>Fill the worksheet (Appendix B). Then watch my demo closely — it models exactly what your team's own case presentation (Cases 2–6) must do: re-teach a key concept, critique a prior attempt, and run an interactive exercise.</w:t>
+        <w:t>Fill the worksheet (Appendix B). Then watch my demo closely — it models exactly what your team's own case presentation (Cases 2–6) must do: teach the case's key idea clearly, and add at least one thing the assigned recording doesn't cover.</w:t>
+      </w:r>
+    </w:p>
+    <w:p>
+      <w:pPr>
+        <w:pStyle w:val="Heading2"/>
+      </w:pPr>
+      <w:r>
+        <w:t>AI voice tutor — starter prompt</w:t>
+      </w:r>
+    </w:p>
+    <w:p>
+      <w:r>
+        <w:t xml:space="preserve">Have </w:t>
+      </w:r>
+      <w:r>
+        <w:rPr>
+          <w:b/>
+        </w:rPr>
+        <w:t>Burns &amp; Veeck, *Marketing Research* (10th ed.), Ch. 2 — The Marketing Research Process</w:t>
+      </w:r>
+      <w:r>
+        <w:t xml:space="preserve"> open (eText or printout) during the session. Copy the prompt below into ChatGPT, switch to voice mode, and work the case out loud:</w:t>
+      </w:r>
+    </w:p>
+    <w:p>
+      <w:pPr>
+        <w:ind w:left="432"/>
+      </w:pPr>
+      <w:r>
+        <w:rPr>
+          <w:i/>
+          <w:sz w:val="19"/>
+        </w:rPr>
+        <w:t>You are my marketing-research case tutor. I am preparing the attached mini-case for IBM 3302. I also have the assigned textbook chapter in front of me — when I cite it, push me to connect the concept to the case. Your rules: quiz me and challenge my positions with follow-up questions; never give me the answer outright; when I'm vague, demand the specific concept, variable, or decision rule; end by making me state my team's final answers out loud so I can write them down. Start by asking me what the case's core decision is.</w:t>
       </w:r>
     </w:p>
     <w:p>
@@ -616,7 +650,7 @@
               <w:rPr>
                 <w:sz w:val="19"/>
               </w:rPr>
-              <w:t>Beat the benchmark: re-teach &amp; critique</w:t>
+              <w:t>Teach the key idea</w:t>
             </w:r>
           </w:p>
         </w:tc>
@@ -652,7 +686,7 @@
               <w:rPr>
                 <w:sz w:val="19"/>
               </w:rPr>
-              <w:t>A key concept re-taught measurably better than the prior recording; the critique names specifics, not vibes</w:t>
+              <w:t>The symptom-vs-decision trap taught clearly enough to apply; the problem → decisions → information → objectives chain walked with the case</w:t>
             </w:r>
           </w:p>
         </w:tc>
@@ -672,7 +706,7 @@
               <w:rPr>
                 <w:sz w:val="19"/>
               </w:rPr>
-              <w:t>Interactive exercise &amp; delivery</w:t>
+              <w:t>Beyond the recording &amp; delivery</w:t>
             </w:r>
           </w:p>
         </w:tc>
@@ -708,7 +742,7 @@
               <w:rPr>
                 <w:sz w:val="19"/>
               </w:rPr>
-              <w:t>Original exercise that makes the class apply the skill; 15 min + 5 Q&amp;A, clear slides, run to time</w:t>
+              <w:t>At least one specific contribution the assigned recording doesn't cover; the class engaged (a question, quick poll, or short exercise); 15 min + 5 Q&amp;A, run to time</w:t>
             </w:r>
           </w:p>
         </w:tc>

</xml_diff>

<commit_message>
Deploy simternship build 2026-09-02
</commit_message>
<xml_diff>
--- a/hub/files/Case1.docx
+++ b/hub/files/Case1.docx
@@ -209,7 +209,7 @@
         <w:t>Problem definition → research questions</w:t>
       </w:r>
       <w:r>
-        <w:t xml:space="preserve"> (watch the assigned pre-watch recording first) → Practice — Summit Point </w:t>
+        <w:t xml:space="preserve"> (live lecture) → Practice — Summit Point </w:t>
       </w:r>
       <w:r>
         <w:rPr>
@@ -355,7 +355,7 @@
         <w:pStyle w:val="ListNumber"/>
       </w:pPr>
       <w:r>
-        <w:t>Fill the worksheet (Appendix B). Then watch my demo closely — it models exactly what your team's own case presentation (Cases 2–6) must do: teach the case's key idea clearly, and add at least one thing the assigned recording doesn't cover.</w:t>
+        <w:t>Fill the worksheet (Appendix B). Then watch my demo closely — it models exactly what your team's own case presentation (Cases 2–6) must do: teach the case's key idea clearly, and add at least one thing the Monday lecture and the textbook chapter don't cover.</w:t>
       </w:r>
     </w:p>
     <w:p>
@@ -706,7 +706,7 @@
               <w:rPr>
                 <w:sz w:val="19"/>
               </w:rPr>
-              <w:t>Beyond the recording &amp; delivery</w:t>
+              <w:t>Beyond the lecture &amp; delivery</w:t>
             </w:r>
           </w:p>
         </w:tc>
@@ -742,7 +742,7 @@
               <w:rPr>
                 <w:sz w:val="19"/>
               </w:rPr>
-              <w:t>At least one specific contribution the assigned recording doesn't cover; the class engaged (a question, quick poll, or short exercise); 15 min + 5 Q&amp;A, run to time</w:t>
+              <w:t>At least one specific contribution the Monday lecture and the textbook chapter don't cover; the class engaged (a question, quick poll, or short exercise); 15 min + 5 Q&amp;A, run to time</w:t>
             </w:r>
           </w:p>
         </w:tc>

</xml_diff>